<commit_message>
doc updated , DB table relationship pdf updated for ott_plans(catalog db), users & subscriptions(subscription db), pending java resource files added into subscription-service
</commit_message>
<xml_diff>
--- a/OtherResource_DocTextPostmandataEtc/catalogcampaign_microservices_ByClaudeAI_15May2026.docx
+++ b/OtherResource_DocTextPostmandataEtc/catalogcampaign_microservices_ByClaudeAI_15May2026.docx
@@ -350,11 +350,9 @@
       <w:pPr>
         <w:spacing w:after="0"/>
       </w:pPr>
-      <w:proofErr w:type="gramStart"/>
       <w:r>
         <w:t>visualize</w:t>
       </w:r>
-      <w:proofErr w:type="gramEnd"/>
     </w:p>
     <w:p>
       <w:pPr>
@@ -368,13 +366,8 @@
       <w:pPr>
         <w:spacing w:after="0"/>
       </w:pPr>
-      <w:proofErr w:type="gramStart"/>
-      <w:r>
-        <w:t>visualize</w:t>
-      </w:r>
-      <w:proofErr w:type="gramEnd"/>
-      <w:r>
-        <w:t xml:space="preserve"> show_widget</w:t>
+      <w:r>
+        <w:t>visualize show_widget</w:t>
       </w:r>
     </w:p>
     <w:p>
@@ -451,13 +444,8 @@
       <w:pPr>
         <w:spacing w:after="0"/>
       </w:pPr>
-      <w:proofErr w:type="gramStart"/>
-      <w:r>
-        <w:t>if</w:t>
-      </w:r>
-      <w:proofErr w:type="gramEnd"/>
-      <w:r>
-        <w:t xml:space="preserve"> I don't start new chat and continue with this single chat everyday then will you be able to have knowledge about the current status? because It won't be possible for me everyday reminds you as I didn't remember much without the revise which will take my lots of time?</w:t>
+      <w:r>
+        <w:t>if I don't start new chat and continue with this single chat everyday then will you be able to have knowledge about the current status? because It won't be possible for me everyday reminds you as I didn't remember much without the revise which will take my lots of time?</w:t>
       </w:r>
     </w:p>
     <w:p>
@@ -647,13 +635,8 @@
       <w:pPr>
         <w:spacing w:after="0"/>
       </w:pPr>
-      <w:proofErr w:type="gramStart"/>
-      <w:r>
-        <w:t>can</w:t>
-      </w:r>
-      <w:proofErr w:type="gramEnd"/>
-      <w:r>
-        <w:t xml:space="preserve"> I pin this chat?</w:t>
+      <w:r>
+        <w:t>can I pin this chat?</w:t>
       </w:r>
     </w:p>
     <w:p>
@@ -1129,13 +1112,8 @@
       <w:pPr>
         <w:spacing w:after="0"/>
       </w:pPr>
-      <w:proofErr w:type="gramStart"/>
-      <w:r>
-        <w:t>java</w:t>
-      </w:r>
-      <w:proofErr w:type="gramEnd"/>
-      <w:r>
-        <w:t xml:space="preserve"> -version</w:t>
+      <w:r>
+        <w:t>java -version</w:t>
       </w:r>
     </w:p>
     <w:p>
@@ -1237,15 +1215,7 @@
         <w:spacing w:after="0"/>
       </w:pPr>
       <w:r>
-        <w:t xml:space="preserve">I have STS latest version will it work? </w:t>
-      </w:r>
-      <w:proofErr w:type="gramStart"/>
-      <w:r>
-        <w:t>as</w:t>
-      </w:r>
-      <w:proofErr w:type="gramEnd"/>
-      <w:r>
-        <w:t xml:space="preserve"> I am more comfirtable with sts and since 11.8 years I am working on it only, and I feel intellij much difficult as never used it, what you suggest me?</w:t>
+        <w:t>I have STS latest version will it work? as I am more comfirtable with sts and since 11.8 years I am working on it only, and I feel intellij much difficult as never used it, what you suggest me?</w:t>
       </w:r>
     </w:p>
     <w:p>
@@ -1297,15 +1267,7 @@
         <w:t>better than IntelliJ for Spring Boot</w:t>
       </w:r>
       <w:r>
-        <w:t xml:space="preserve"> in many ways — it understands </w:t>
-      </w:r>
-      <w:proofErr w:type="gramStart"/>
-      <w:r>
-        <w:t>Spring</w:t>
-      </w:r>
-      <w:proofErr w:type="gramEnd"/>
-      <w:r>
-        <w:t xml:space="preserve"> annotations natively, has built-in Spring project wizards, and you already know every shortcut. That's a huge advantage.</w:t>
+        <w:t xml:space="preserve"> in many ways — it understands Spring annotations natively, has built-in Spring project wizards, and you already know every shortcut. That's a huge advantage.</w:t>
       </w:r>
     </w:p>
     <w:p>
@@ -1360,13 +1322,8 @@
       <w:pPr>
         <w:spacing w:after="0"/>
       </w:pPr>
-      <w:proofErr w:type="gramStart"/>
-      <w:r>
-        <w:t>java</w:t>
-      </w:r>
-      <w:proofErr w:type="gramEnd"/>
-      <w:r>
-        <w:t xml:space="preserve"> -version</w:t>
+      <w:r>
+        <w:t>java -version</w:t>
       </w:r>
     </w:p>
     <w:p>
@@ -1385,13 +1342,8 @@
       <w:pPr>
         <w:spacing w:after="0"/>
       </w:pPr>
-      <w:proofErr w:type="gramStart"/>
-      <w:r>
-        <w:t>mvn</w:t>
-      </w:r>
-      <w:proofErr w:type="gramEnd"/>
-      <w:r>
-        <w:t xml:space="preserve"> -version</w:t>
+      <w:r>
+        <w:t>mvn -version</w:t>
       </w:r>
     </w:p>
     <w:p>
@@ -1423,13 +1375,8 @@
       <w:pPr>
         <w:spacing w:after="0"/>
       </w:pPr>
-      <w:proofErr w:type="gramStart"/>
-      <w:r>
-        <w:t>ott-platform</w:t>
-      </w:r>
-      <w:proofErr w:type="gramEnd"/>
-      <w:r>
-        <w:t>/</w:t>
+      <w:r>
+        <w:t>ott-platform/</w:t>
       </w:r>
     </w:p>
     <w:p>
@@ -1457,15 +1404,7 @@
         <w:spacing w:after="0"/>
       </w:pPr>
       <w:r>
-        <w:t>└── subscription-service</w:t>
-      </w:r>
-      <w:proofErr w:type="gramStart"/>
-      <w:r>
-        <w:t>/  ←</w:t>
-      </w:r>
-      <w:proofErr w:type="gramEnd"/>
-      <w:r>
-        <w:t xml:space="preserve"> handles user subscriptions, calls catalog-service</w:t>
+        <w:t>└── subscription-service/  ← handles user subscriptions, calls catalog-service</w:t>
       </w:r>
     </w:p>
     <w:p>
@@ -1548,13 +1487,8 @@
       <w:pPr>
         <w:spacing w:after="0"/>
       </w:pPr>
-      <w:proofErr w:type="gramStart"/>
-      <w:r>
-        <w:t>see</w:t>
-      </w:r>
-      <w:proofErr w:type="gramEnd"/>
-      <w:r>
-        <w:t xml:space="preserve"> the versions</w:t>
+      <w:r>
+        <w:t>see the versions</w:t>
       </w:r>
     </w:p>
     <w:p>
@@ -2234,23 +2168,13 @@
           </wp:inline>
         </w:drawing>
       </w:r>
-      <w:proofErr w:type="gramStart"/>
       <w:r>
         <w:rPr>
           <w:b/>
           <w:bCs/>
           <w:highlight w:val="yellow"/>
         </w:rPr>
-        <w:t>imported</w:t>
-      </w:r>
-      <w:proofErr w:type="gramEnd"/>
-      <w:r>
-        <w:rPr>
-          <w:b/>
-          <w:bCs/>
-          <w:highlight w:val="yellow"/>
-        </w:rPr>
-        <w:t xml:space="preserve"> succesfully</w:t>
+        <w:t>imported succesfully</w:t>
       </w:r>
       <w:r>
         <w:rPr>
@@ -2325,21 +2249,17 @@
       <w:pPr>
         <w:spacing w:after="0"/>
       </w:pPr>
-      <w:proofErr w:type="gramStart"/>
       <w:r>
         <w:t>catalog-service</w:t>
       </w:r>
-      <w:proofErr w:type="gramEnd"/>
-    </w:p>
-    <w:p>
-      <w:pPr>
-        <w:spacing w:after="0"/>
-      </w:pPr>
-      <w:proofErr w:type="gramStart"/>
+    </w:p>
+    <w:p>
+      <w:pPr>
+        <w:spacing w:after="0"/>
+      </w:pPr>
       <w:r>
         <w:t>subscription-service</w:t>
       </w:r>
-      <w:proofErr w:type="gramEnd"/>
     </w:p>
     <w:p>
       <w:pPr>
@@ -2409,13 +2329,8 @@
       <w:pPr>
         <w:spacing w:after="0"/>
       </w:pPr>
-      <w:proofErr w:type="gramStart"/>
-      <w:r>
-        <w:t>src/main/java/com/ott/catalog</w:t>
-      </w:r>
-      <w:proofErr w:type="gramEnd"/>
-      <w:r>
-        <w:t xml:space="preserve"> → Right click → New → Class</w:t>
+      <w:r>
+        <w:t>src/main/java/com/ott/catalog → Right click → New → Class</w:t>
       </w:r>
     </w:p>
     <w:p>
@@ -2438,100 +2353,58 @@
       <w:pPr>
         <w:spacing w:after="0"/>
       </w:pPr>
-      <w:proofErr w:type="gramStart"/>
-      <w:r>
-        <w:t>javapackage</w:t>
-      </w:r>
-      <w:proofErr w:type="gramEnd"/>
-      <w:r>
-        <w:t xml:space="preserve"> com.ott.catalog;</w:t>
-      </w:r>
-    </w:p>
-    <w:p>
-      <w:pPr>
-        <w:spacing w:after="0"/>
-      </w:pPr>
-    </w:p>
-    <w:p>
-      <w:pPr>
-        <w:spacing w:after="0"/>
-      </w:pPr>
-      <w:proofErr w:type="gramStart"/>
-      <w:r>
-        <w:t>public</w:t>
-      </w:r>
-      <w:proofErr w:type="gramEnd"/>
-      <w:r>
-        <w:t xml:space="preserve"> class OttPlan {</w:t>
-      </w:r>
-    </w:p>
-    <w:p>
-      <w:pPr>
-        <w:spacing w:after="0"/>
-      </w:pPr>
-    </w:p>
-    <w:p>
-      <w:pPr>
-        <w:spacing w:after="0"/>
-      </w:pPr>
-      <w:r>
-        <w:t xml:space="preserve">    </w:t>
-      </w:r>
-      <w:proofErr w:type="gramStart"/>
-      <w:r>
-        <w:t>private</w:t>
-      </w:r>
-      <w:proofErr w:type="gramEnd"/>
-      <w:r>
-        <w:t xml:space="preserve"> String planId;</w:t>
-      </w:r>
-    </w:p>
-    <w:p>
-      <w:pPr>
-        <w:spacing w:after="0"/>
-      </w:pPr>
-      <w:r>
-        <w:t xml:space="preserve">    </w:t>
-      </w:r>
-      <w:proofErr w:type="gramStart"/>
-      <w:r>
-        <w:t>private</w:t>
-      </w:r>
-      <w:proofErr w:type="gramEnd"/>
-      <w:r>
-        <w:t xml:space="preserve"> String planName;</w:t>
-      </w:r>
-    </w:p>
-    <w:p>
-      <w:pPr>
-        <w:spacing w:after="0"/>
-      </w:pPr>
-      <w:r>
-        <w:t xml:space="preserve">    </w:t>
-      </w:r>
-      <w:proofErr w:type="gramStart"/>
-      <w:r>
-        <w:t>private</w:t>
-      </w:r>
-      <w:proofErr w:type="gramEnd"/>
-      <w:r>
-        <w:t xml:space="preserve"> double price;</w:t>
-      </w:r>
-    </w:p>
-    <w:p>
-      <w:pPr>
-        <w:spacing w:after="0"/>
-      </w:pPr>
-      <w:r>
-        <w:t xml:space="preserve">    </w:t>
-      </w:r>
-      <w:proofErr w:type="gramStart"/>
-      <w:r>
-        <w:t>private</w:t>
-      </w:r>
-      <w:proofErr w:type="gramEnd"/>
-      <w:r>
-        <w:t xml:space="preserve"> String duration; // MONTHLY or YEARLY</w:t>
+      <w:r>
+        <w:t>javapackage com.ott.catalog;</w:t>
+      </w:r>
+    </w:p>
+    <w:p>
+      <w:pPr>
+        <w:spacing w:after="0"/>
+      </w:pPr>
+    </w:p>
+    <w:p>
+      <w:pPr>
+        <w:spacing w:after="0"/>
+      </w:pPr>
+      <w:r>
+        <w:t>public class OttPlan {</w:t>
+      </w:r>
+    </w:p>
+    <w:p>
+      <w:pPr>
+        <w:spacing w:after="0"/>
+      </w:pPr>
+    </w:p>
+    <w:p>
+      <w:pPr>
+        <w:spacing w:after="0"/>
+      </w:pPr>
+      <w:r>
+        <w:t xml:space="preserve">    private String planId;</w:t>
+      </w:r>
+    </w:p>
+    <w:p>
+      <w:pPr>
+        <w:spacing w:after="0"/>
+      </w:pPr>
+      <w:r>
+        <w:t xml:space="preserve">    private String planName;</w:t>
+      </w:r>
+    </w:p>
+    <w:p>
+      <w:pPr>
+        <w:spacing w:after="0"/>
+      </w:pPr>
+      <w:r>
+        <w:t xml:space="preserve">    private double price;</w:t>
+      </w:r>
+    </w:p>
+    <w:p>
+      <w:pPr>
+        <w:spacing w:after="0"/>
+      </w:pPr>
+      <w:r>
+        <w:t xml:space="preserve">    private String duration; // MONTHLY or YEARLY</w:t>
       </w:r>
     </w:p>
     <w:p>
@@ -2552,15 +2425,7 @@
         <w:spacing w:after="0"/>
       </w:pPr>
       <w:r>
-        <w:t xml:space="preserve">    </w:t>
-      </w:r>
-      <w:proofErr w:type="gramStart"/>
-      <w:r>
-        <w:t>public</w:t>
-      </w:r>
-      <w:proofErr w:type="gramEnd"/>
-      <w:r>
-        <w:t xml:space="preserve"> OttPlan(String planId, String planName, double price, String duration) {</w:t>
+        <w:t xml:space="preserve">    public OttPlan(String planId, String planName, double price, String duration) {</w:t>
       </w:r>
     </w:p>
     <w:p>
@@ -2621,63 +2486,31 @@
         <w:spacing w:after="0"/>
       </w:pPr>
       <w:r>
-        <w:t xml:space="preserve">    </w:t>
-      </w:r>
-      <w:proofErr w:type="gramStart"/>
-      <w:r>
-        <w:t>public</w:t>
-      </w:r>
-      <w:proofErr w:type="gramEnd"/>
-      <w:r>
-        <w:t xml:space="preserve"> String getPlanId() { return planId; }</w:t>
-      </w:r>
-    </w:p>
-    <w:p>
-      <w:pPr>
-        <w:spacing w:after="0"/>
-      </w:pPr>
-      <w:r>
-        <w:t xml:space="preserve">    </w:t>
-      </w:r>
-      <w:proofErr w:type="gramStart"/>
-      <w:r>
-        <w:t>public</w:t>
-      </w:r>
-      <w:proofErr w:type="gramEnd"/>
-      <w:r>
-        <w:t xml:space="preserve"> String getPlanName() { return planName; }</w:t>
-      </w:r>
-    </w:p>
-    <w:p>
-      <w:pPr>
-        <w:spacing w:after="0"/>
-      </w:pPr>
-      <w:r>
-        <w:t xml:space="preserve">    </w:t>
-      </w:r>
-      <w:proofErr w:type="gramStart"/>
-      <w:r>
-        <w:t>public</w:t>
-      </w:r>
-      <w:proofErr w:type="gramEnd"/>
-      <w:r>
-        <w:t xml:space="preserve"> double getPrice() { return price; }</w:t>
-      </w:r>
-    </w:p>
-    <w:p>
-      <w:pPr>
-        <w:spacing w:after="0"/>
-      </w:pPr>
-      <w:r>
-        <w:t xml:space="preserve">    </w:t>
-      </w:r>
-      <w:proofErr w:type="gramStart"/>
-      <w:r>
-        <w:t>public</w:t>
-      </w:r>
-      <w:proofErr w:type="gramEnd"/>
-      <w:r>
-        <w:t xml:space="preserve"> String getDuration() { return duration; }</w:t>
+        <w:t xml:space="preserve">    public String getPlanId() { return planId; }</w:t>
+      </w:r>
+    </w:p>
+    <w:p>
+      <w:pPr>
+        <w:spacing w:after="0"/>
+      </w:pPr>
+      <w:r>
+        <w:t xml:space="preserve">    public String getPlanName() { return planName; }</w:t>
+      </w:r>
+    </w:p>
+    <w:p>
+      <w:pPr>
+        <w:spacing w:after="0"/>
+      </w:pPr>
+      <w:r>
+        <w:t xml:space="preserve">    public double getPrice() { return price; }</w:t>
+      </w:r>
+    </w:p>
+    <w:p>
+      <w:pPr>
+        <w:spacing w:after="0"/>
+      </w:pPr>
+      <w:r>
+        <w:t xml:space="preserve">    public String getDuration() { return duration; }</w:t>
       </w:r>
     </w:p>
     <w:p>
@@ -2721,30 +2554,22 @@
           <w:highlight w:val="yellow"/>
         </w:rPr>
       </w:pPr>
-      <w:proofErr w:type="gramStart"/>
       <w:r>
         <w:rPr>
           <w:highlight w:val="yellow"/>
         </w:rPr>
         <w:lastRenderedPageBreak/>
-        <w:t>provide</w:t>
-      </w:r>
-      <w:proofErr w:type="gramEnd"/>
+        <w:t xml:space="preserve">provide me the complete code of catalog-service and subscription-service with controller, model, </w:t>
+      </w:r>
+    </w:p>
+    <w:p>
+      <w:pPr>
+        <w:spacing w:after="0"/>
+      </w:pPr>
       <w:r>
         <w:rPr>
           <w:highlight w:val="yellow"/>
         </w:rPr>
-        <w:t xml:space="preserve"> me the complete code of catalog-service and subscription-service with controller, model, </w:t>
-      </w:r>
-    </w:p>
-    <w:p>
-      <w:pPr>
-        <w:spacing w:after="0"/>
-      </w:pPr>
-      <w:r>
-        <w:rPr>
-          <w:highlight w:val="yellow"/>
-        </w:rPr>
         <w:t>repository(with mysql db not on the fly data by constructor etc) ,service and with Centrallized exception handling with proper packages (like enterprise level project standards) and how to call using postman how to send data and if token also needed then let this also clear how to create it(as we don't have espn portal ui to operate and functionate the microservices code)  and code would be in market standard So that I can confidently face the interviewer questions and if is there any mysql schema/sql is there then provide me that as well.</w:t>
       </w:r>
     </w:p>
@@ -2764,21 +2589,7 @@
         <w:rPr>
           <w:color w:val="FF0000"/>
         </w:rPr>
-        <w:t xml:space="preserve">Problem with code generated by </w:t>
-      </w:r>
-      <w:proofErr w:type="gramStart"/>
-      <w:r>
-        <w:rPr>
-          <w:color w:val="FF0000"/>
-        </w:rPr>
-        <w:t>claude</w:t>
-      </w:r>
-      <w:proofErr w:type="gramEnd"/>
-      <w:r>
-        <w:rPr>
-          <w:color w:val="FF0000"/>
-        </w:rPr>
-        <w:t>:</w:t>
+        <w:t>Problem with code generated by claude:</w:t>
       </w:r>
     </w:p>
     <w:p>
@@ -3020,7 +2831,6 @@
           <w:lang w:eastAsia="en-IN" w:bidi="hi-IN"/>
         </w:rPr>
       </w:pPr>
-      <w:proofErr w:type="gramStart"/>
       <w:r>
         <w:rPr>
           <w:rFonts w:ascii="Times New Roman" w:eastAsia="Times New Roman" w:hAnsi="Times New Roman" w:cs="Times New Roman"/>
@@ -3032,7 +2842,6 @@
         </w:rPr>
         <w:t>bash</w:t>
       </w:r>
-      <w:proofErr w:type="gramEnd"/>
     </w:p>
     <w:p>
       <w:pPr>
@@ -3045,7 +2854,6 @@
           <w:lang w:eastAsia="en-IN" w:bidi="hi-IN"/>
         </w:rPr>
       </w:pPr>
-      <w:proofErr w:type="gramStart"/>
       <w:r>
         <w:rPr>
           <w:rFonts w:ascii="var(--font-mono)" w:eastAsia="Times New Roman" w:hAnsi="var(--font-mono)" w:cs="Courier New"/>
@@ -3056,7 +2864,6 @@
         </w:rPr>
         <w:t>mkdir</w:t>
       </w:r>
-      <w:proofErr w:type="gramEnd"/>
       <w:r>
         <w:rPr>
           <w:rFonts w:ascii="var(--font-mono)" w:eastAsia="Times New Roman" w:hAnsi="var(--font-mono)" w:cs="Courier New"/>
@@ -3688,51 +3495,7 @@
           <w:highlight w:val="yellow"/>
           <w:lang w:eastAsia="en-IN" w:bidi="hi-IN"/>
         </w:rPr>
-        <w:t xml:space="preserve">I have prepared both the </w:t>
-      </w:r>
-      <w:proofErr w:type="gramStart"/>
-      <w:r>
-        <w:rPr>
-          <w:rFonts w:ascii="Times New Roman" w:eastAsia="Times New Roman" w:hAnsi="Times New Roman" w:cs="Times New Roman"/>
-          <w:sz w:val="24"/>
-          <w:szCs w:val="24"/>
-          <w:highlight w:val="yellow"/>
-          <w:lang w:eastAsia="en-IN" w:bidi="hi-IN"/>
-        </w:rPr>
-        <w:t>services ,</w:t>
-      </w:r>
-      <w:proofErr w:type="gramEnd"/>
-      <w:r>
-        <w:rPr>
-          <w:rFonts w:ascii="Times New Roman" w:eastAsia="Times New Roman" w:hAnsi="Times New Roman" w:cs="Times New Roman"/>
-          <w:sz w:val="24"/>
-          <w:szCs w:val="24"/>
-          <w:highlight w:val="yellow"/>
-          <w:lang w:eastAsia="en-IN" w:bidi="hi-IN"/>
-        </w:rPr>
-        <w:t xml:space="preserve"> I asked you last time to let me know the way how to start my services and how to test using postman, please provide me proper steps using ui example snaps so that it could be easy to understand in one chat I want most of the information out of you to save other chats to proceed soon to achieve my goal asap without waiting of next expired chat message and wait for some time again to again assigning me the next slots for free chats. and one more thing please note that whenever you provide me steps please keep this in your mind I am using windows 10 not linux/unix so based on windows 10 only provide me the steps. </w:t>
-      </w:r>
-      <w:proofErr w:type="gramStart"/>
-      <w:r>
-        <w:rPr>
-          <w:rFonts w:ascii="Times New Roman" w:eastAsia="Times New Roman" w:hAnsi="Times New Roman" w:cs="Times New Roman"/>
-          <w:sz w:val="24"/>
-          <w:szCs w:val="24"/>
-          <w:highlight w:val="yellow"/>
-          <w:lang w:eastAsia="en-IN" w:bidi="hi-IN"/>
-        </w:rPr>
-        <w:t>last</w:t>
-      </w:r>
-      <w:proofErr w:type="gramEnd"/>
-      <w:r>
-        <w:rPr>
-          <w:rFonts w:ascii="Times New Roman" w:eastAsia="Times New Roman" w:hAnsi="Times New Roman" w:cs="Times New Roman"/>
-          <w:sz w:val="24"/>
-          <w:szCs w:val="24"/>
-          <w:highlight w:val="yellow"/>
-          <w:lang w:eastAsia="en-IN" w:bidi="hi-IN"/>
-        </w:rPr>
-        <w:t xml:space="preserve"> time you  provided bash command based file which does't support in windows so next time keep this thing in your mind. So please provide me the next steps:</w:t>
+        <w:t>I have prepared both the services , I asked you last time to let me know the way how to start my services and how to test using postman, please provide me proper steps using ui example snaps so that it could be easy to understand in one chat I want most of the information out of you to save other chats to proceed soon to achieve my goal asap without waiting of next expired chat message and wait for some time again to again assigning me the next slots for free chats. and one more thing please note that whenever you provide me steps please keep this in your mind I am using windows 10 not linux/unix so based on windows 10 only provide me the steps. last time you  provided bash command based file which does't support in windows so next time keep this thing in your mind. So please provide me the next steps:</w:t>
       </w:r>
     </w:p>
     <w:p>
@@ -4688,47 +4451,7 @@
           <w:szCs w:val="24"/>
           <w:lang w:eastAsia="en-IN" w:bidi="hi-IN"/>
         </w:rPr>
-        <w:t xml:space="preserve">I have prepared both the </w:t>
-      </w:r>
-      <w:proofErr w:type="gramStart"/>
-      <w:r>
-        <w:rPr>
-          <w:rFonts w:ascii="Times New Roman" w:eastAsia="Times New Roman" w:hAnsi="Times New Roman" w:cs="Times New Roman"/>
-          <w:sz w:val="24"/>
-          <w:szCs w:val="24"/>
-          <w:lang w:eastAsia="en-IN" w:bidi="hi-IN"/>
-        </w:rPr>
-        <w:t>services ,</w:t>
-      </w:r>
-      <w:proofErr w:type="gramEnd"/>
-      <w:r>
-        <w:rPr>
-          <w:rFonts w:ascii="Times New Roman" w:eastAsia="Times New Roman" w:hAnsi="Times New Roman" w:cs="Times New Roman"/>
-          <w:sz w:val="24"/>
-          <w:szCs w:val="24"/>
-          <w:lang w:eastAsia="en-IN" w:bidi="hi-IN"/>
-        </w:rPr>
-        <w:t xml:space="preserve"> I asked you last time to let me know the way how to start my services and how to test using postman, please provide me proper steps using ui example snaps so that it could be easy to understand in one chat I want most of the information out of you to save other chats to proceed soon to achieve my goal asap without waiting of next expired chat message and wait for some time again to again assigning me the next slots for free chats. and one more thing please note that whenever you provide me steps please keep this in your mind I am using windows 10 not linux/unix so based on windows 10 only provide me the steps. </w:t>
-      </w:r>
-      <w:proofErr w:type="gramStart"/>
-      <w:r>
-        <w:rPr>
-          <w:rFonts w:ascii="Times New Roman" w:eastAsia="Times New Roman" w:hAnsi="Times New Roman" w:cs="Times New Roman"/>
-          <w:sz w:val="24"/>
-          <w:szCs w:val="24"/>
-          <w:lang w:eastAsia="en-IN" w:bidi="hi-IN"/>
-        </w:rPr>
-        <w:t>last</w:t>
-      </w:r>
-      <w:proofErr w:type="gramEnd"/>
-      <w:r>
-        <w:rPr>
-          <w:rFonts w:ascii="Times New Roman" w:eastAsia="Times New Roman" w:hAnsi="Times New Roman" w:cs="Times New Roman"/>
-          <w:sz w:val="24"/>
-          <w:szCs w:val="24"/>
-          <w:lang w:eastAsia="en-IN" w:bidi="hi-IN"/>
-        </w:rPr>
-        <w:t xml:space="preserve"> time you provided bash command based file which does't support in windows so next time keep this thing in your mind. So please provide me the next steps: - to run the applications -and steps to test all the api with input(if required) through postman - refer one sample picture for every steps for better understanding - do not provide the commands or any steps which doesn't support in windows10 os</w:t>
+        <w:t>I have prepared both the services , I asked you last time to let me know the way how to start my services and how to test using postman, please provide me proper steps using ui example snaps so that it could be easy to understand in one chat I want most of the information out of you to save other chats to proceed soon to achieve my goal asap without waiting of next expired chat message and wait for some time again to again assigning me the next slots for free chats. and one more thing please note that whenever you provide me steps please keep this in your mind I am using windows 10 not linux/unix so based on windows 10 only provide me the steps. last time you provided bash command based file which does't support in windows so next time keep this thing in your mind. So please provide me the next steps: - to run the applications -and steps to test all the api with input(if required) through postman - refer one sample picture for every steps for better understanding - do not provide the commands or any steps which doesn't support in windows10 os</w:t>
       </w:r>
     </w:p>
     <w:p>
@@ -5487,7 +5210,6 @@
           <w:lang w:eastAsia="en-IN" w:bidi="hi-IN"/>
         </w:rPr>
       </w:pPr>
-      <w:proofErr w:type="gramStart"/>
       <w:r>
         <w:rPr>
           <w:rFonts w:ascii="Times New Roman" w:eastAsia="Times New Roman" w:hAnsi="Times New Roman" w:cs="Times New Roman"/>
@@ -5497,7 +5219,6 @@
         </w:rPr>
         <w:t>properties</w:t>
       </w:r>
-      <w:proofErr w:type="gramEnd"/>
     </w:p>
     <w:p>
       <w:pPr>
@@ -5815,27 +5536,7 @@
           <w:sz w:val="24"/>
           <w:szCs w:val="24"/>
         </w:rPr>
-        <w:t xml:space="preserve">Catalog-service is working perfectly fine all the </w:t>
-      </w:r>
-      <w:proofErr w:type="gramStart"/>
-      <w:r>
-        <w:rPr>
-          <w:b/>
-          <w:bCs/>
-          <w:sz w:val="24"/>
-          <w:szCs w:val="24"/>
-        </w:rPr>
-        <w:t>url</w:t>
-      </w:r>
-      <w:proofErr w:type="gramEnd"/>
-      <w:r>
-        <w:rPr>
-          <w:b/>
-          <w:bCs/>
-          <w:sz w:val="24"/>
-          <w:szCs w:val="24"/>
-        </w:rPr>
-        <w:t xml:space="preserve"> checked</w:t>
+        <w:t>Catalog-service is working perfectly fine all the url checked</w:t>
       </w:r>
     </w:p>
     <w:p>
@@ -5894,9 +5595,41 @@
           <w:sz w:val="18"/>
           <w:szCs w:val="18"/>
         </w:rPr>
-        <w:t>http</w:t>
-      </w:r>
-      <w:proofErr w:type="gramStart"/>
+        <w:t>http://localhost:8081/catalog/plans</w:t>
+      </w:r>
+      <w:r>
+        <w:rPr>
+          <w:rStyle w:val="api-desc"/>
+          <w:rFonts w:ascii="Segoe UI" w:hAnsi="Segoe UI" w:cs="Segoe UI"/>
+          <w:color w:val="718096"/>
+          <w:sz w:val="17"/>
+          <w:szCs w:val="17"/>
+        </w:rPr>
+        <w:t>Get all active plans</w:t>
+      </w:r>
+    </w:p>
+    <w:p>
+      <w:pPr>
+        <w:rPr>
+          <w:rFonts w:ascii="Segoe UI" w:hAnsi="Segoe UI" w:cs="Segoe UI"/>
+          <w:color w:val="E2E8F0"/>
+          <w:sz w:val="27"/>
+          <w:szCs w:val="27"/>
+        </w:rPr>
+      </w:pPr>
+      <w:r>
+        <w:rPr>
+          <w:rStyle w:val="api-method"/>
+          <w:rFonts w:ascii="Segoe UI" w:hAnsi="Segoe UI" w:cs="Segoe UI"/>
+          <w:b/>
+          <w:bCs/>
+          <w:color w:val="9AE6B4"/>
+          <w:sz w:val="17"/>
+          <w:szCs w:val="17"/>
+          <w:shd w:val="clear" w:color="auto" w:fill="1C4532"/>
+        </w:rPr>
+        <w:t>GET</w:t>
+      </w:r>
       <w:r>
         <w:rPr>
           <w:rStyle w:val="api-url"/>
@@ -5905,9 +5638,41 @@
           <w:sz w:val="18"/>
           <w:szCs w:val="18"/>
         </w:rPr>
-        <w:t>:/</w:t>
-      </w:r>
-      <w:proofErr w:type="gramEnd"/>
+        <w:t>http://localhost:8081/catalog/plans/PLAN001</w:t>
+      </w:r>
+      <w:r>
+        <w:rPr>
+          <w:rStyle w:val="api-desc"/>
+          <w:rFonts w:ascii="Segoe UI" w:hAnsi="Segoe UI" w:cs="Segoe UI"/>
+          <w:color w:val="718096"/>
+          <w:sz w:val="17"/>
+          <w:szCs w:val="17"/>
+        </w:rPr>
+        <w:t>Get plan by ID</w:t>
+      </w:r>
+    </w:p>
+    <w:p>
+      <w:pPr>
+        <w:rPr>
+          <w:rFonts w:ascii="Segoe UI" w:hAnsi="Segoe UI" w:cs="Segoe UI"/>
+          <w:color w:val="E2E8F0"/>
+          <w:sz w:val="27"/>
+          <w:szCs w:val="27"/>
+        </w:rPr>
+      </w:pPr>
+      <w:r>
+        <w:rPr>
+          <w:rStyle w:val="api-method"/>
+          <w:rFonts w:ascii="Segoe UI" w:hAnsi="Segoe UI" w:cs="Segoe UI"/>
+          <w:b/>
+          <w:bCs/>
+          <w:color w:val="9AE6B4"/>
+          <w:sz w:val="17"/>
+          <w:szCs w:val="17"/>
+          <w:shd w:val="clear" w:color="auto" w:fill="1C4532"/>
+        </w:rPr>
+        <w:t>GET</w:t>
+      </w:r>
       <w:r>
         <w:rPr>
           <w:rStyle w:val="api-url"/>
@@ -5916,7 +5681,7 @@
           <w:sz w:val="18"/>
           <w:szCs w:val="18"/>
         </w:rPr>
-        <w:t>/localhost:8081/catalog/plans</w:t>
+        <w:t>http://localhost:8081/catalog/plans/duration/MONTHLY</w:t>
       </w:r>
       <w:r>
         <w:rPr>
@@ -5926,7 +5691,7 @@
           <w:sz w:val="17"/>
           <w:szCs w:val="17"/>
         </w:rPr>
-        <w:t>Get all active plans</w:t>
+        <w:t>Get monthly plans</w:t>
       </w:r>
     </w:p>
     <w:p>
@@ -5944,12 +5709,12 @@
           <w:rFonts w:ascii="Segoe UI" w:hAnsi="Segoe UI" w:cs="Segoe UI"/>
           <w:b/>
           <w:bCs/>
-          <w:color w:val="9AE6B4"/>
+          <w:color w:val="FBD38D"/>
           <w:sz w:val="17"/>
           <w:szCs w:val="17"/>
-          <w:shd w:val="clear" w:color="auto" w:fill="1C4532"/>
-        </w:rPr>
-        <w:t>GET</w:t>
+          <w:shd w:val="clear" w:color="auto" w:fill="744210"/>
+        </w:rPr>
+        <w:t>POST</w:t>
       </w:r>
       <w:r>
         <w:rPr>
@@ -5959,9 +5724,41 @@
           <w:sz w:val="18"/>
           <w:szCs w:val="18"/>
         </w:rPr>
-        <w:t>http</w:t>
-      </w:r>
-      <w:proofErr w:type="gramStart"/>
+        <w:t>http://localhost:8081/catalog/plans</w:t>
+      </w:r>
+      <w:r>
+        <w:rPr>
+          <w:rStyle w:val="api-desc"/>
+          <w:rFonts w:ascii="Segoe UI" w:hAnsi="Segoe UI" w:cs="Segoe UI"/>
+          <w:color w:val="718096"/>
+          <w:sz w:val="17"/>
+          <w:szCs w:val="17"/>
+        </w:rPr>
+        <w:t>Create new plan (with JSON body)</w:t>
+      </w:r>
+    </w:p>
+    <w:p>
+      <w:pPr>
+        <w:rPr>
+          <w:rFonts w:ascii="Segoe UI" w:hAnsi="Segoe UI" w:cs="Segoe UI"/>
+          <w:color w:val="E2E8F0"/>
+          <w:sz w:val="27"/>
+          <w:szCs w:val="27"/>
+        </w:rPr>
+      </w:pPr>
+      <w:r>
+        <w:rPr>
+          <w:rStyle w:val="api-method"/>
+          <w:rFonts w:ascii="Segoe UI" w:hAnsi="Segoe UI" w:cs="Segoe UI"/>
+          <w:b/>
+          <w:bCs/>
+          <w:color w:val="D6BCFA"/>
+          <w:sz w:val="17"/>
+          <w:szCs w:val="17"/>
+          <w:shd w:val="clear" w:color="auto" w:fill="322659"/>
+        </w:rPr>
+        <w:t>PUT</w:t>
+      </w:r>
       <w:r>
         <w:rPr>
           <w:rStyle w:val="api-url"/>
@@ -5970,9 +5767,41 @@
           <w:sz w:val="18"/>
           <w:szCs w:val="18"/>
         </w:rPr>
-        <w:t>:/</w:t>
-      </w:r>
-      <w:proofErr w:type="gramEnd"/>
+        <w:t>http://localhost:8081/catalog/plans/PLAN001</w:t>
+      </w:r>
+      <w:r>
+        <w:rPr>
+          <w:rStyle w:val="api-desc"/>
+          <w:rFonts w:ascii="Segoe UI" w:hAnsi="Segoe UI" w:cs="Segoe UI"/>
+          <w:color w:val="718096"/>
+          <w:sz w:val="17"/>
+          <w:szCs w:val="17"/>
+        </w:rPr>
+        <w:t>Update a plan</w:t>
+      </w:r>
+    </w:p>
+    <w:p>
+      <w:pPr>
+        <w:rPr>
+          <w:rFonts w:ascii="Segoe UI" w:hAnsi="Segoe UI" w:cs="Segoe UI"/>
+          <w:color w:val="E2E8F0"/>
+          <w:sz w:val="27"/>
+          <w:szCs w:val="27"/>
+        </w:rPr>
+      </w:pPr>
+      <w:r>
+        <w:rPr>
+          <w:rStyle w:val="api-method"/>
+          <w:rFonts w:ascii="Segoe UI" w:hAnsi="Segoe UI" w:cs="Segoe UI"/>
+          <w:b/>
+          <w:bCs/>
+          <w:color w:val="FEB2B2"/>
+          <w:sz w:val="17"/>
+          <w:szCs w:val="17"/>
+          <w:shd w:val="clear" w:color="auto" w:fill="742A2A"/>
+        </w:rPr>
+        <w:t>DEL</w:t>
+      </w:r>
       <w:r>
         <w:rPr>
           <w:rStyle w:val="api-url"/>
@@ -5981,7 +5810,7 @@
           <w:sz w:val="18"/>
           <w:szCs w:val="18"/>
         </w:rPr>
-        <w:t>/localhost:8081/catalog/plans/PLAN001</w:t>
+        <w:t>http://localhost:8081/catalog/plans/PLAN001</w:t>
       </w:r>
       <w:r>
         <w:rPr>
@@ -5991,266 +5820,6 @@
           <w:sz w:val="17"/>
           <w:szCs w:val="17"/>
         </w:rPr>
-        <w:t>Get plan by ID</w:t>
-      </w:r>
-    </w:p>
-    <w:p>
-      <w:pPr>
-        <w:rPr>
-          <w:rFonts w:ascii="Segoe UI" w:hAnsi="Segoe UI" w:cs="Segoe UI"/>
-          <w:color w:val="E2E8F0"/>
-          <w:sz w:val="27"/>
-          <w:szCs w:val="27"/>
-        </w:rPr>
-      </w:pPr>
-      <w:r>
-        <w:rPr>
-          <w:rStyle w:val="api-method"/>
-          <w:rFonts w:ascii="Segoe UI" w:hAnsi="Segoe UI" w:cs="Segoe UI"/>
-          <w:b/>
-          <w:bCs/>
-          <w:color w:val="9AE6B4"/>
-          <w:sz w:val="17"/>
-          <w:szCs w:val="17"/>
-          <w:shd w:val="clear" w:color="auto" w:fill="1C4532"/>
-        </w:rPr>
-        <w:t>GET</w:t>
-      </w:r>
-      <w:r>
-        <w:rPr>
-          <w:rStyle w:val="api-url"/>
-          <w:rFonts w:ascii="Courier New" w:hAnsi="Courier New" w:cs="Courier New"/>
-          <w:color w:val="63B3ED"/>
-          <w:sz w:val="18"/>
-          <w:szCs w:val="18"/>
-        </w:rPr>
-        <w:t>http</w:t>
-      </w:r>
-      <w:proofErr w:type="gramStart"/>
-      <w:r>
-        <w:rPr>
-          <w:rStyle w:val="api-url"/>
-          <w:rFonts w:ascii="Courier New" w:hAnsi="Courier New" w:cs="Courier New"/>
-          <w:color w:val="63B3ED"/>
-          <w:sz w:val="18"/>
-          <w:szCs w:val="18"/>
-        </w:rPr>
-        <w:t>:/</w:t>
-      </w:r>
-      <w:proofErr w:type="gramEnd"/>
-      <w:r>
-        <w:rPr>
-          <w:rStyle w:val="api-url"/>
-          <w:rFonts w:ascii="Courier New" w:hAnsi="Courier New" w:cs="Courier New"/>
-          <w:color w:val="63B3ED"/>
-          <w:sz w:val="18"/>
-          <w:szCs w:val="18"/>
-        </w:rPr>
-        <w:t>/localhost:8081/catalog/plans/duration/MONTHLY</w:t>
-      </w:r>
-      <w:r>
-        <w:rPr>
-          <w:rStyle w:val="api-desc"/>
-          <w:rFonts w:ascii="Segoe UI" w:hAnsi="Segoe UI" w:cs="Segoe UI"/>
-          <w:color w:val="718096"/>
-          <w:sz w:val="17"/>
-          <w:szCs w:val="17"/>
-        </w:rPr>
-        <w:t>Get monthly plans</w:t>
-      </w:r>
-    </w:p>
-    <w:p>
-      <w:pPr>
-        <w:rPr>
-          <w:rFonts w:ascii="Segoe UI" w:hAnsi="Segoe UI" w:cs="Segoe UI"/>
-          <w:color w:val="E2E8F0"/>
-          <w:sz w:val="27"/>
-          <w:szCs w:val="27"/>
-        </w:rPr>
-      </w:pPr>
-      <w:r>
-        <w:rPr>
-          <w:rStyle w:val="api-method"/>
-          <w:rFonts w:ascii="Segoe UI" w:hAnsi="Segoe UI" w:cs="Segoe UI"/>
-          <w:b/>
-          <w:bCs/>
-          <w:color w:val="FBD38D"/>
-          <w:sz w:val="17"/>
-          <w:szCs w:val="17"/>
-          <w:shd w:val="clear" w:color="auto" w:fill="744210"/>
-        </w:rPr>
-        <w:t>POST</w:t>
-      </w:r>
-      <w:r>
-        <w:rPr>
-          <w:rStyle w:val="api-url"/>
-          <w:rFonts w:ascii="Courier New" w:hAnsi="Courier New" w:cs="Courier New"/>
-          <w:color w:val="63B3ED"/>
-          <w:sz w:val="18"/>
-          <w:szCs w:val="18"/>
-        </w:rPr>
-        <w:t>http</w:t>
-      </w:r>
-      <w:proofErr w:type="gramStart"/>
-      <w:r>
-        <w:rPr>
-          <w:rStyle w:val="api-url"/>
-          <w:rFonts w:ascii="Courier New" w:hAnsi="Courier New" w:cs="Courier New"/>
-          <w:color w:val="63B3ED"/>
-          <w:sz w:val="18"/>
-          <w:szCs w:val="18"/>
-        </w:rPr>
-        <w:t>:/</w:t>
-      </w:r>
-      <w:proofErr w:type="gramEnd"/>
-      <w:r>
-        <w:rPr>
-          <w:rStyle w:val="api-url"/>
-          <w:rFonts w:ascii="Courier New" w:hAnsi="Courier New" w:cs="Courier New"/>
-          <w:color w:val="63B3ED"/>
-          <w:sz w:val="18"/>
-          <w:szCs w:val="18"/>
-        </w:rPr>
-        <w:t>/localhost:8081/catalog/plans</w:t>
-      </w:r>
-      <w:r>
-        <w:rPr>
-          <w:rStyle w:val="api-desc"/>
-          <w:rFonts w:ascii="Segoe UI" w:hAnsi="Segoe UI" w:cs="Segoe UI"/>
-          <w:color w:val="718096"/>
-          <w:sz w:val="17"/>
-          <w:szCs w:val="17"/>
-        </w:rPr>
-        <w:t>Create new plan (with JSON body)</w:t>
-      </w:r>
-    </w:p>
-    <w:p>
-      <w:pPr>
-        <w:rPr>
-          <w:rFonts w:ascii="Segoe UI" w:hAnsi="Segoe UI" w:cs="Segoe UI"/>
-          <w:color w:val="E2E8F0"/>
-          <w:sz w:val="27"/>
-          <w:szCs w:val="27"/>
-        </w:rPr>
-      </w:pPr>
-      <w:r>
-        <w:rPr>
-          <w:rStyle w:val="api-method"/>
-          <w:rFonts w:ascii="Segoe UI" w:hAnsi="Segoe UI" w:cs="Segoe UI"/>
-          <w:b/>
-          <w:bCs/>
-          <w:color w:val="D6BCFA"/>
-          <w:sz w:val="17"/>
-          <w:szCs w:val="17"/>
-          <w:shd w:val="clear" w:color="auto" w:fill="322659"/>
-        </w:rPr>
-        <w:t>PUT</w:t>
-      </w:r>
-      <w:r>
-        <w:rPr>
-          <w:rStyle w:val="api-url"/>
-          <w:rFonts w:ascii="Courier New" w:hAnsi="Courier New" w:cs="Courier New"/>
-          <w:color w:val="63B3ED"/>
-          <w:sz w:val="18"/>
-          <w:szCs w:val="18"/>
-        </w:rPr>
-        <w:t>http</w:t>
-      </w:r>
-      <w:proofErr w:type="gramStart"/>
-      <w:r>
-        <w:rPr>
-          <w:rStyle w:val="api-url"/>
-          <w:rFonts w:ascii="Courier New" w:hAnsi="Courier New" w:cs="Courier New"/>
-          <w:color w:val="63B3ED"/>
-          <w:sz w:val="18"/>
-          <w:szCs w:val="18"/>
-        </w:rPr>
-        <w:t>:/</w:t>
-      </w:r>
-      <w:proofErr w:type="gramEnd"/>
-      <w:r>
-        <w:rPr>
-          <w:rStyle w:val="api-url"/>
-          <w:rFonts w:ascii="Courier New" w:hAnsi="Courier New" w:cs="Courier New"/>
-          <w:color w:val="63B3ED"/>
-          <w:sz w:val="18"/>
-          <w:szCs w:val="18"/>
-        </w:rPr>
-        <w:t>/localhost:8081/catalog/plans/PLAN001</w:t>
-      </w:r>
-      <w:r>
-        <w:rPr>
-          <w:rStyle w:val="api-desc"/>
-          <w:rFonts w:ascii="Segoe UI" w:hAnsi="Segoe UI" w:cs="Segoe UI"/>
-          <w:color w:val="718096"/>
-          <w:sz w:val="17"/>
-          <w:szCs w:val="17"/>
-        </w:rPr>
-        <w:t>Update a plan</w:t>
-      </w:r>
-    </w:p>
-    <w:p>
-      <w:pPr>
-        <w:rPr>
-          <w:rFonts w:ascii="Segoe UI" w:hAnsi="Segoe UI" w:cs="Segoe UI"/>
-          <w:color w:val="E2E8F0"/>
-          <w:sz w:val="27"/>
-          <w:szCs w:val="27"/>
-        </w:rPr>
-      </w:pPr>
-      <w:r>
-        <w:rPr>
-          <w:rStyle w:val="api-method"/>
-          <w:rFonts w:ascii="Segoe UI" w:hAnsi="Segoe UI" w:cs="Segoe UI"/>
-          <w:b/>
-          <w:bCs/>
-          <w:color w:val="FEB2B2"/>
-          <w:sz w:val="17"/>
-          <w:szCs w:val="17"/>
-          <w:shd w:val="clear" w:color="auto" w:fill="742A2A"/>
-        </w:rPr>
-        <w:t>DEL</w:t>
-      </w:r>
-      <w:r>
-        <w:rPr>
-          <w:rStyle w:val="api-url"/>
-          <w:rFonts w:ascii="Courier New" w:hAnsi="Courier New" w:cs="Courier New"/>
-          <w:color w:val="63B3ED"/>
-          <w:sz w:val="18"/>
-          <w:szCs w:val="18"/>
-        </w:rPr>
-        <w:t>http</w:t>
-      </w:r>
-      <w:proofErr w:type="gramStart"/>
-      <w:r>
-        <w:rPr>
-          <w:rStyle w:val="api-url"/>
-          <w:rFonts w:ascii="Courier New" w:hAnsi="Courier New" w:cs="Courier New"/>
-          <w:color w:val="63B3ED"/>
-          <w:sz w:val="18"/>
-          <w:szCs w:val="18"/>
-        </w:rPr>
-        <w:t>:/</w:t>
-      </w:r>
-      <w:proofErr w:type="gramEnd"/>
-      <w:r>
-        <w:rPr>
-          <w:rStyle w:val="api-url"/>
-          <w:rFonts w:ascii="Courier New" w:hAnsi="Courier New" w:cs="Courier New"/>
-          <w:color w:val="63B3ED"/>
-          <w:sz w:val="18"/>
-          <w:szCs w:val="18"/>
-        </w:rPr>
-        <w:t>/localhost:8081/catalog/plans/PLAN001</w:t>
-      </w:r>
-      <w:r>
-        <w:rPr>
-          <w:rStyle w:val="api-desc"/>
-          <w:rFonts w:ascii="Segoe UI" w:hAnsi="Segoe UI" w:cs="Segoe UI"/>
-          <w:color w:val="718096"/>
-          <w:sz w:val="17"/>
-          <w:szCs w:val="17"/>
-        </w:rPr>
         <w:t>Deactivate a plan</w:t>
       </w:r>
     </w:p>
@@ -6265,8 +5834,10 @@
       </w:pPr>
       <w:r>
         <w:rPr>
-          <w:sz w:val="24"/>
-          <w:szCs w:val="24"/>
+          <w:noProof/>
+          <w:sz w:val="24"/>
+          <w:szCs w:val="24"/>
+          <w:lang w:eastAsia="en-IN" w:bidi="hi-IN"/>
         </w:rPr>
         <w:lastRenderedPageBreak/>
         <w:drawing>
@@ -6344,7 +5915,6 @@
         </w:rPr>
         <w:t xml:space="preserve">Files are missing from </w:t>
       </w:r>
-      <w:proofErr w:type="gramStart"/>
       <w:r>
         <w:rPr>
           <w:b/>
@@ -6353,31 +5923,15 @@
           <w:szCs w:val="40"/>
           <w:highlight w:val="yellow"/>
         </w:rPr>
-        <w:t>ClaudeAi ,</w:t>
-      </w:r>
-      <w:proofErr w:type="gramEnd"/>
-      <w:r>
-        <w:rPr>
-          <w:b/>
-          <w:bCs/>
-          <w:sz w:val="40"/>
-          <w:szCs w:val="40"/>
-          <w:highlight w:val="yellow"/>
-        </w:rPr>
-        <w:t xml:space="preserve"> so asked again because errors are there in the projects</w:t>
-      </w:r>
-    </w:p>
-    <w:p>
-      <w:pPr>
-        <w:spacing w:after="0"/>
-      </w:pPr>
-      <w:proofErr w:type="gramStart"/>
-      <w:r>
-        <w:t>you</w:t>
-      </w:r>
-      <w:proofErr w:type="gramEnd"/>
-      <w:r>
-        <w:t xml:space="preserve"> have not provide me __UserRepository.java__</w:t>
+        <w:t>ClaudeAi , so asked again because errors are there in the projects</w:t>
+      </w:r>
+    </w:p>
+    <w:p>
+      <w:pPr>
+        <w:spacing w:after="0"/>
+      </w:pPr>
+      <w:r>
+        <w:t>you have not provide me __UserRepository.java__</w:t>
       </w:r>
     </w:p>
     <w:p>
@@ -6423,85 +5977,58 @@
       <w:pPr>
         <w:spacing w:after="0"/>
       </w:pPr>
-      <w:proofErr w:type="gramStart"/>
       <w:r>
         <w:t>java</w:t>
       </w:r>
-      <w:proofErr w:type="gramEnd"/>
-    </w:p>
-    <w:p>
-      <w:pPr>
-        <w:spacing w:after="0"/>
-      </w:pPr>
-      <w:proofErr w:type="gramStart"/>
-      <w:r>
-        <w:t>package</w:t>
-      </w:r>
-      <w:proofErr w:type="gramEnd"/>
-      <w:r>
-        <w:t xml:space="preserve"> com.ott.subscription.repository;</w:t>
-      </w:r>
-    </w:p>
-    <w:p>
-      <w:pPr>
-        <w:spacing w:after="0"/>
-      </w:pPr>
-    </w:p>
-    <w:p>
-      <w:pPr>
-        <w:spacing w:after="0"/>
-      </w:pPr>
-      <w:proofErr w:type="gramStart"/>
-      <w:r>
-        <w:t>import</w:t>
-      </w:r>
-      <w:proofErr w:type="gramEnd"/>
-      <w:r>
-        <w:t xml:space="preserve"> com.ott.subscription.model.User;</w:t>
-      </w:r>
-    </w:p>
-    <w:p>
-      <w:pPr>
-        <w:spacing w:after="0"/>
-      </w:pPr>
-      <w:proofErr w:type="gramStart"/>
-      <w:r>
-        <w:t>import</w:t>
-      </w:r>
-      <w:proofErr w:type="gramEnd"/>
-      <w:r>
-        <w:t xml:space="preserve"> org.springframework.data.jpa.repository.JpaRepository;</w:t>
-      </w:r>
-    </w:p>
-    <w:p>
-      <w:pPr>
-        <w:spacing w:after="0"/>
-      </w:pPr>
-      <w:proofErr w:type="gramStart"/>
-      <w:r>
-        <w:t>import</w:t>
-      </w:r>
-      <w:proofErr w:type="gramEnd"/>
-      <w:r>
-        <w:t xml:space="preserve"> org.springframework.stereotype.Repository;</w:t>
-      </w:r>
-    </w:p>
-    <w:p>
-      <w:pPr>
-        <w:spacing w:after="0"/>
-      </w:pPr>
-    </w:p>
-    <w:p>
-      <w:pPr>
-        <w:spacing w:after="0"/>
-      </w:pPr>
-      <w:proofErr w:type="gramStart"/>
-      <w:r>
-        <w:t>import</w:t>
-      </w:r>
-      <w:proofErr w:type="gramEnd"/>
-      <w:r>
-        <w:t xml:space="preserve"> java.util.Optional;</w:t>
+    </w:p>
+    <w:p>
+      <w:pPr>
+        <w:spacing w:after="0"/>
+      </w:pPr>
+      <w:r>
+        <w:t>package com.ott.subscription.repository;</w:t>
+      </w:r>
+    </w:p>
+    <w:p>
+      <w:pPr>
+        <w:spacing w:after="0"/>
+      </w:pPr>
+    </w:p>
+    <w:p>
+      <w:pPr>
+        <w:spacing w:after="0"/>
+      </w:pPr>
+      <w:r>
+        <w:t>import com.ott.subscription.model.User;</w:t>
+      </w:r>
+    </w:p>
+    <w:p>
+      <w:pPr>
+        <w:spacing w:after="0"/>
+      </w:pPr>
+      <w:r>
+        <w:t>import org.springframework.data.jpa.repository.JpaRepository;</w:t>
+      </w:r>
+    </w:p>
+    <w:p>
+      <w:pPr>
+        <w:spacing w:after="0"/>
+      </w:pPr>
+      <w:r>
+        <w:t>import org.springframework.stereotype.Repository;</w:t>
+      </w:r>
+    </w:p>
+    <w:p>
+      <w:pPr>
+        <w:spacing w:after="0"/>
+      </w:pPr>
+    </w:p>
+    <w:p>
+      <w:pPr>
+        <w:spacing w:after="0"/>
+      </w:pPr>
+      <w:r>
+        <w:t>import java.util.Optional;</w:t>
       </w:r>
     </w:p>
     <w:p>
@@ -6546,63 +6073,31 @@
         <w:spacing w:after="0"/>
       </w:pPr>
       <w:r>
-        <w:t xml:space="preserve"> * - </w:t>
-      </w:r>
-      <w:proofErr w:type="gramStart"/>
-      <w:r>
-        <w:t>findAll(</w:t>
-      </w:r>
-      <w:proofErr w:type="gramEnd"/>
-      <w:r>
-        <w:t>)        → SELECT * FROM users</w:t>
-      </w:r>
-    </w:p>
-    <w:p>
-      <w:pPr>
-        <w:spacing w:after="0"/>
-      </w:pPr>
-      <w:r>
-        <w:t xml:space="preserve"> * - </w:t>
-      </w:r>
-      <w:proofErr w:type="gramStart"/>
-      <w:r>
-        <w:t>findById(</w:t>
-      </w:r>
-      <w:proofErr w:type="gramEnd"/>
-      <w:r>
-        <w:t>)       → SELECT * FROM users WHERE user_id = ?</w:t>
-      </w:r>
-    </w:p>
-    <w:p>
-      <w:pPr>
-        <w:spacing w:after="0"/>
-      </w:pPr>
-      <w:r>
-        <w:t xml:space="preserve"> * - </w:t>
-      </w:r>
-      <w:proofErr w:type="gramStart"/>
-      <w:r>
-        <w:t>save(</w:t>
-      </w:r>
-      <w:proofErr w:type="gramEnd"/>
-      <w:r>
-        <w:t>)           → INSERT or UPDATE</w:t>
-      </w:r>
-    </w:p>
-    <w:p>
-      <w:pPr>
-        <w:spacing w:after="0"/>
-      </w:pPr>
-      <w:r>
-        <w:t xml:space="preserve"> * - </w:t>
-      </w:r>
-      <w:proofErr w:type="gramStart"/>
-      <w:r>
-        <w:t>deleteById(</w:t>
-      </w:r>
-      <w:proofErr w:type="gramEnd"/>
-      <w:r>
-        <w:t>)     → DELETE FROM users WHERE user_id = ?</w:t>
+        <w:t xml:space="preserve"> * - findAll()        → SELECT * FROM users</w:t>
+      </w:r>
+    </w:p>
+    <w:p>
+      <w:pPr>
+        <w:spacing w:after="0"/>
+      </w:pPr>
+      <w:r>
+        <w:t xml:space="preserve"> * - findById()       → SELECT * FROM users WHERE user_id = ?</w:t>
+      </w:r>
+    </w:p>
+    <w:p>
+      <w:pPr>
+        <w:spacing w:after="0"/>
+      </w:pPr>
+      <w:r>
+        <w:t xml:space="preserve"> * - save()           → INSERT or UPDATE</w:t>
+      </w:r>
+    </w:p>
+    <w:p>
+      <w:pPr>
+        <w:spacing w:after="0"/>
+      </w:pPr>
+      <w:r>
+        <w:t xml:space="preserve"> * - deleteById()     → DELETE FROM users WHERE user_id = ?</w:t>
       </w:r>
     </w:p>
     <w:p>
@@ -6618,31 +6113,15 @@
         <w:spacing w:after="0"/>
       </w:pPr>
       <w:r>
-        <w:t xml:space="preserve"> * Custom methods below — </w:t>
-      </w:r>
-      <w:proofErr w:type="gramStart"/>
-      <w:r>
-        <w:t>Spring</w:t>
-      </w:r>
-      <w:proofErr w:type="gramEnd"/>
-      <w:r>
-        <w:t xml:space="preserve"> generates SQL automatically</w:t>
-      </w:r>
-    </w:p>
-    <w:p>
-      <w:pPr>
-        <w:spacing w:after="0"/>
-      </w:pPr>
-      <w:r>
-        <w:t xml:space="preserve"> * </w:t>
-      </w:r>
-      <w:proofErr w:type="gramStart"/>
-      <w:r>
-        <w:t>just</w:t>
-      </w:r>
-      <w:proofErr w:type="gramEnd"/>
-      <w:r>
-        <w:t xml:space="preserve"> by reading the method name. No SQL needed!</w:t>
+        <w:t xml:space="preserve"> * Custom methods below — Spring generates SQL automatically</w:t>
+      </w:r>
+    </w:p>
+    <w:p>
+      <w:pPr>
+        <w:spacing w:after="0"/>
+      </w:pPr>
+      <w:r>
+        <w:t xml:space="preserve"> * just by reading the method name. No SQL needed!</w:t>
       </w:r>
     </w:p>
     <w:p>
@@ -6665,156 +6144,93 @@
       <w:pPr>
         <w:spacing w:after="0"/>
       </w:pPr>
-      <w:proofErr w:type="gramStart"/>
       <w:r>
         <w:lastRenderedPageBreak/>
-        <w:t>public</w:t>
-      </w:r>
-      <w:proofErr w:type="gramEnd"/>
-      <w:r>
-        <w:t xml:space="preserve"> interface UserRepository extends JpaRepository&lt;User, Long&gt; {</w:t>
-      </w:r>
-    </w:p>
-    <w:p>
-      <w:pPr>
-        <w:spacing w:after="0"/>
-      </w:pPr>
-    </w:p>
-    <w:p>
-      <w:pPr>
-        <w:spacing w:after="0"/>
-      </w:pPr>
-      <w:r>
-        <w:t xml:space="preserve">    // SELECT * FROM users WHERE username </w:t>
-      </w:r>
-      <w:proofErr w:type="gramStart"/>
-      <w:r>
-        <w:t>= ?</w:t>
-      </w:r>
-      <w:proofErr w:type="gramEnd"/>
-    </w:p>
-    <w:p>
-      <w:pPr>
-        <w:spacing w:after="0"/>
-      </w:pPr>
-      <w:r>
-        <w:t xml:space="preserve">    Optional&lt;User&gt; </w:t>
-      </w:r>
-      <w:proofErr w:type="gramStart"/>
-      <w:r>
-        <w:t>findByUsername(</w:t>
-      </w:r>
-      <w:proofErr w:type="gramEnd"/>
-      <w:r>
-        <w:t>String username);</w:t>
-      </w:r>
-    </w:p>
-    <w:p>
-      <w:pPr>
-        <w:spacing w:after="0"/>
-      </w:pPr>
-    </w:p>
-    <w:p>
-      <w:pPr>
-        <w:spacing w:after="0"/>
-      </w:pPr>
-      <w:r>
-        <w:t xml:space="preserve">    // SELECT * FROM users WHERE email </w:t>
-      </w:r>
-      <w:proofErr w:type="gramStart"/>
-      <w:r>
-        <w:t>= ?</w:t>
-      </w:r>
-      <w:proofErr w:type="gramEnd"/>
-    </w:p>
-    <w:p>
-      <w:pPr>
-        <w:spacing w:after="0"/>
-      </w:pPr>
-      <w:r>
-        <w:t xml:space="preserve">    Optional&lt;User&gt; </w:t>
-      </w:r>
-      <w:proofErr w:type="gramStart"/>
-      <w:r>
-        <w:t>findByEmail(</w:t>
-      </w:r>
-      <w:proofErr w:type="gramEnd"/>
-      <w:r>
-        <w:t>String email);</w:t>
-      </w:r>
-    </w:p>
-    <w:p>
-      <w:pPr>
-        <w:spacing w:after="0"/>
-      </w:pPr>
-    </w:p>
-    <w:p>
-      <w:pPr>
-        <w:spacing w:after="0"/>
-      </w:pPr>
-      <w:r>
-        <w:t xml:space="preserve">    // SELECT </w:t>
-      </w:r>
-      <w:proofErr w:type="gramStart"/>
-      <w:r>
-        <w:t>COUNT(</w:t>
-      </w:r>
-      <w:proofErr w:type="gramEnd"/>
-      <w:r>
-        <w:t>*) &gt; 0 FROM users WHERE email = ?</w:t>
-      </w:r>
-    </w:p>
-    <w:p>
-      <w:pPr>
-        <w:spacing w:after="0"/>
-      </w:pPr>
-      <w:r>
-        <w:t xml:space="preserve">    </w:t>
-      </w:r>
-      <w:proofErr w:type="gramStart"/>
-      <w:r>
-        <w:t>boolean</w:t>
-      </w:r>
-      <w:proofErr w:type="gramEnd"/>
-      <w:r>
-        <w:t xml:space="preserve"> existsByEmail(String email);</w:t>
-      </w:r>
-    </w:p>
-    <w:p>
-      <w:pPr>
-        <w:spacing w:after="0"/>
-      </w:pPr>
-    </w:p>
-    <w:p>
-      <w:pPr>
-        <w:spacing w:after="0"/>
-      </w:pPr>
-      <w:r>
-        <w:t xml:space="preserve">    // SELECT </w:t>
-      </w:r>
-      <w:proofErr w:type="gramStart"/>
-      <w:r>
-        <w:t>COUNT(</w:t>
-      </w:r>
-      <w:proofErr w:type="gramEnd"/>
-      <w:r>
-        <w:t>*) &gt; 0 FROM users WHERE username = ?</w:t>
-      </w:r>
-    </w:p>
-    <w:p>
-      <w:pPr>
-        <w:spacing w:after="0"/>
-      </w:pPr>
-      <w:r>
-        <w:t xml:space="preserve">    </w:t>
-      </w:r>
-      <w:proofErr w:type="gramStart"/>
-      <w:r>
-        <w:t>boolean</w:t>
-      </w:r>
-      <w:proofErr w:type="gramEnd"/>
-      <w:r>
-        <w:t xml:space="preserve"> existsByUsername(String username);</w:t>
+        <w:t>public interface UserRepository extends JpaRepository&lt;User, Long&gt; {</w:t>
+      </w:r>
+    </w:p>
+    <w:p>
+      <w:pPr>
+        <w:spacing w:after="0"/>
+      </w:pPr>
+    </w:p>
+    <w:p>
+      <w:pPr>
+        <w:spacing w:after="0"/>
+      </w:pPr>
+      <w:r>
+        <w:t xml:space="preserve">    // SELECT * FROM users WHERE username = ?</w:t>
+      </w:r>
+    </w:p>
+    <w:p>
+      <w:pPr>
+        <w:spacing w:after="0"/>
+      </w:pPr>
+      <w:r>
+        <w:t xml:space="preserve">    Optional&lt;User&gt; findByUsername(String username);</w:t>
+      </w:r>
+    </w:p>
+    <w:p>
+      <w:pPr>
+        <w:spacing w:after="0"/>
+      </w:pPr>
+    </w:p>
+    <w:p>
+      <w:pPr>
+        <w:spacing w:after="0"/>
+      </w:pPr>
+      <w:r>
+        <w:t xml:space="preserve">    // SELECT * FROM users WHERE email = ?</w:t>
+      </w:r>
+    </w:p>
+    <w:p>
+      <w:pPr>
+        <w:spacing w:after="0"/>
+      </w:pPr>
+      <w:r>
+        <w:t xml:space="preserve">    Optional&lt;User&gt; findByEmail(String email);</w:t>
+      </w:r>
+    </w:p>
+    <w:p>
+      <w:pPr>
+        <w:spacing w:after="0"/>
+      </w:pPr>
+    </w:p>
+    <w:p>
+      <w:pPr>
+        <w:spacing w:after="0"/>
+      </w:pPr>
+      <w:r>
+        <w:t xml:space="preserve">    // SELECT COUNT(*) &gt; 0 FROM users WHERE email = ?</w:t>
+      </w:r>
+    </w:p>
+    <w:p>
+      <w:pPr>
+        <w:spacing w:after="0"/>
+      </w:pPr>
+      <w:r>
+        <w:t xml:space="preserve">    boolean existsByEmail(String email);</w:t>
+      </w:r>
+    </w:p>
+    <w:p>
+      <w:pPr>
+        <w:spacing w:after="0"/>
+      </w:pPr>
+    </w:p>
+    <w:p>
+      <w:pPr>
+        <w:spacing w:after="0"/>
+      </w:pPr>
+      <w:r>
+        <w:t xml:space="preserve">    // SELECT COUNT(*) &gt; 0 FROM users WHERE username = ?</w:t>
+      </w:r>
+    </w:p>
+    <w:p>
+      <w:pPr>
+        <w:spacing w:after="0"/>
+      </w:pPr>
+      <w:r>
+        <w:t xml:space="preserve">    boolean existsByUsername(String username);</w:t>
       </w:r>
     </w:p>
     <w:p>
@@ -6842,13 +6258,8 @@
       <w:pPr>
         <w:spacing w:after="0"/>
       </w:pPr>
-      <w:proofErr w:type="gramStart"/>
-      <w:r>
-        <w:t>repository</w:t>
-      </w:r>
-      <w:proofErr w:type="gramEnd"/>
-      <w:r>
-        <w:t>/</w:t>
+      <w:r>
+        <w:t>repository/</w:t>
       </w:r>
     </w:p>
     <w:p>
@@ -6885,15 +6296,7 @@
         <w:spacing w:after="0"/>
       </w:pPr>
       <w:r>
-        <w:t xml:space="preserve">└── </w:t>
-      </w:r>
-      <w:proofErr w:type="gramStart"/>
-      <w:r>
-        <w:t>SubscriptionRepository.java  ←</w:t>
-      </w:r>
-      <w:proofErr w:type="gramEnd"/>
-      <w:r>
-        <w:t xml:space="preserve"> already provided earlier</w:t>
+        <w:t>└── SubscriptionRepository.java  ← already provided earlier</w:t>
       </w:r>
     </w:p>
     <w:p>
@@ -6933,36 +6336,15 @@
         <w:spacing w:after="0"/>
       </w:pPr>
       <w:r>
-        <w:t>__</w:t>
-      </w:r>
-      <w:proofErr w:type="gramStart"/>
-      <w:r>
-        <w:t>SubscriptionResponseDTO.java ,</w:t>
-      </w:r>
-      <w:proofErr w:type="gramEnd"/>
-      <w:r>
-        <w:t xml:space="preserve"> SubscriptionNotFoundException.java,  UserNotFoundException.java__</w:t>
-      </w:r>
-    </w:p>
-    <w:p>
-      <w:pPr>
-        <w:spacing w:after="0"/>
-      </w:pPr>
-      <w:proofErr w:type="gramStart"/>
-      <w:r>
-        <w:t>all</w:t>
-      </w:r>
-      <w:proofErr w:type="gramEnd"/>
-      <w:r>
-        <w:t xml:space="preserve"> those file are also missing please don't waste my time on these kind of stuff where I un necesarily put my efforts and waste of my time due to your mistakes. if anything still missing which you didn't provided me then provide it right </w:t>
-      </w:r>
-      <w:proofErr w:type="gramStart"/>
-      <w:r>
-        <w:t>away ,</w:t>
-      </w:r>
-      <w:proofErr w:type="gramEnd"/>
-      <w:r>
-        <w:t xml:space="preserve"> and one more important thing i want to ask in advance if in case you are using RestTemplate for the communication , I want feign client implementation right away so that I could start working , and provide me all the java src file and second feign client implementation this time because I don't know when the limit will finish again.</w:t>
+        <w:t>__SubscriptionResponseDTO.java , SubscriptionNotFoundException.java,  UserNotFoundException.java__</w:t>
+      </w:r>
+    </w:p>
+    <w:p>
+      <w:pPr>
+        <w:spacing w:after="0"/>
+      </w:pPr>
+      <w:r>
+        <w:t>all those file are also missing please don't waste my time on these kind of stuff where I un necesarily put my efforts and waste of my time due to your mistakes. if anything still missing which you didn't provided me then provide it right away , and one more important thing i want to ask in advance if in case you are using RestTemplate for the communication , I want feign client implementation right away so that I could start working , and provide me all the java src file and second feign client implementation this time because I don't know when the limit will finish again.</w:t>
       </w:r>
     </w:p>
     <w:p>
@@ -7110,13 +6492,8 @@
       <w:pPr>
         <w:spacing w:after="0"/>
       </w:pPr>
-      <w:proofErr w:type="gramStart"/>
-      <w:r>
-        <w:t>client/CatalogClient.java</w:t>
-      </w:r>
-      <w:proofErr w:type="gramEnd"/>
-      <w:r>
-        <w:t xml:space="preserve"> — delete this entirely</w:t>
+      <w:r>
+        <w:t>client/CatalogClient.java — delete this entirely</w:t>
       </w:r>
     </w:p>
     <w:p>
@@ -7138,6 +6515,389 @@
       </w:pPr>
       <w:r>
         <w:t>pom.xml — new version adds Spring Cloud + Feign dependency</w:t>
+      </w:r>
+    </w:p>
+    <w:p>
+      <w:pPr>
+        <w:spacing w:after="0"/>
+      </w:pPr>
+      <w:r>
+        <w:t>SubscriptionServiceApplication.java — adds @EnableFeignClients</w:t>
+      </w:r>
+    </w:p>
+    <w:p>
+      <w:pPr>
+        <w:spacing w:after="0"/>
+      </w:pPr>
+      <w:r>
+        <w:t>application.properties — adds Feign logging config</w:t>
+      </w:r>
+    </w:p>
+    <w:p>
+      <w:pPr>
+        <w:spacing w:after="0"/>
+      </w:pPr>
+      <w:r>
+        <w:t>config/AppConfig.java — removes RestTemplate bean, adds Feign config</w:t>
+      </w:r>
+    </w:p>
+    <w:p>
+      <w:pPr>
+        <w:spacing w:after="0"/>
+      </w:pPr>
+      <w:r>
+        <w:t>service/SubscriptionService.java — uses CatalogServiceClient instead of CatalogClient</w:t>
+      </w:r>
+    </w:p>
+    <w:p>
+      <w:pPr>
+        <w:spacing w:after="0"/>
+      </w:pPr>
+      <w:r>
+        <w:t>Files to CREATE (brand new):</w:t>
+      </w:r>
+    </w:p>
+    <w:p>
+      <w:pPr>
+        <w:spacing w:after="0"/>
+      </w:pPr>
+    </w:p>
+    <w:p>
+      <w:pPr>
+        <w:spacing w:after="0"/>
+      </w:pPr>
+      <w:r>
+        <w:t>client/CatalogServiceClient.java — Feign interface</w:t>
+      </w:r>
+    </w:p>
+    <w:p>
+      <w:pPr>
+        <w:spacing w:after="0"/>
+      </w:pPr>
+      <w:r>
+        <w:t>client/FeignErrorDecoder.java — handles Catalog Service errors</w:t>
+      </w:r>
+    </w:p>
+    <w:p>
+      <w:pPr>
+        <w:spacing w:after="0"/>
+      </w:pPr>
+      <w:r>
+        <w:t>dto/OttPlanDTO.java — maps Catalog Service JSON response</w:t>
+      </w:r>
+    </w:p>
+    <w:p>
+      <w:pPr>
+        <w:spacing w:after="0"/>
+      </w:pPr>
+      <w:r>
+        <w:t>dto/SubscriptionResponseDTO.java — was missing</w:t>
+      </w:r>
+    </w:p>
+    <w:p>
+      <w:pPr>
+        <w:spacing w:after="0"/>
+      </w:pPr>
+      <w:r>
+        <w:t>exception/SubscriptionNotFoundException.java — was missing</w:t>
+      </w:r>
+    </w:p>
+    <w:p>
+      <w:pPr>
+        <w:spacing w:after="0"/>
+      </w:pPr>
+      <w:r>
+        <w:t>exception/UserNotFoundException.java — was missing</w:t>
+      </w:r>
+    </w:p>
+    <w:p>
+      <w:pPr>
+        <w:spacing w:after="0"/>
+      </w:pPr>
+      <w:r>
+        <w:t xml:space="preserve">After updating pom.xml, right-click project → Maven → Update Project → OK and STS will download Feign automatically. Then run catalog-service first, then subscription-service. </w:t>
+      </w:r>
+      <w:r>
+        <w:rPr>
+          <w:rFonts w:ascii="Segoe UI Symbol" w:hAnsi="Segoe UI Symbol" w:cs="Segoe UI Symbol"/>
+        </w:rPr>
+        <w:t>🚀</w:t>
+      </w:r>
+    </w:p>
+    <w:p>
+      <w:pPr>
+        <w:spacing w:after="0"/>
+      </w:pPr>
+    </w:p>
+    <w:p>
+      <w:pPr>
+        <w:spacing w:after="0"/>
+      </w:pPr>
+    </w:p>
+    <w:p>
+      <w:pPr>
+        <w:spacing w:after="0"/>
+      </w:pPr>
+      <w:r>
+        <w:t>Pom</w:t>
+      </w:r>
+    </w:p>
+    <w:p>
+      <w:pPr>
+        <w:spacing w:after="0"/>
+      </w:pPr>
+      <w:r>
+        <w:t xml:space="preserve">XML </w:t>
+      </w:r>
+    </w:p>
+    <w:p>
+      <w:pPr>
+        <w:spacing w:after="0"/>
+      </w:pPr>
+    </w:p>
+    <w:p>
+      <w:pPr>
+        <w:spacing w:after="0"/>
+      </w:pPr>
+      <w:r>
+        <w:t>Subscriptionserviceapplication</w:t>
+      </w:r>
+    </w:p>
+    <w:p>
+      <w:pPr>
+        <w:spacing w:after="0"/>
+      </w:pPr>
+      <w:r>
+        <w:t xml:space="preserve">Code · JAVA </w:t>
+      </w:r>
+    </w:p>
+    <w:p>
+      <w:pPr>
+        <w:spacing w:after="0"/>
+      </w:pPr>
+    </w:p>
+    <w:p>
+      <w:pPr>
+        <w:spacing w:after="0"/>
+      </w:pPr>
+      <w:r>
+        <w:t>Application</w:t>
+      </w:r>
+    </w:p>
+    <w:p>
+      <w:pPr>
+        <w:spacing w:after="0"/>
+      </w:pPr>
+      <w:r>
+        <w:t xml:space="preserve">PROPERTIES </w:t>
+      </w:r>
+    </w:p>
+    <w:p>
+      <w:pPr>
+        <w:spacing w:after="0"/>
+      </w:pPr>
+    </w:p>
+    <w:p>
+      <w:pPr>
+        <w:spacing w:after="0"/>
+      </w:pPr>
+      <w:r>
+        <w:t>Catalogserviceclient</w:t>
+      </w:r>
+    </w:p>
+    <w:p>
+      <w:pPr>
+        <w:spacing w:after="0"/>
+      </w:pPr>
+      <w:r>
+        <w:t xml:space="preserve">Code · JAVA </w:t>
+      </w:r>
+    </w:p>
+    <w:p>
+      <w:pPr>
+        <w:spacing w:after="0"/>
+      </w:pPr>
+    </w:p>
+    <w:p>
+      <w:pPr>
+        <w:spacing w:after="0"/>
+      </w:pPr>
+      <w:r>
+        <w:t>Feignerrordecoder</w:t>
+      </w:r>
+    </w:p>
+    <w:p>
+      <w:pPr>
+        <w:spacing w:after="0"/>
+      </w:pPr>
+      <w:r>
+        <w:t xml:space="preserve">Code · JAVA </w:t>
+      </w:r>
+    </w:p>
+    <w:p>
+      <w:pPr>
+        <w:spacing w:after="0"/>
+      </w:pPr>
+    </w:p>
+    <w:p>
+      <w:pPr>
+        <w:spacing w:after="0"/>
+      </w:pPr>
+      <w:r>
+        <w:t>Appconfig</w:t>
+      </w:r>
+    </w:p>
+    <w:p>
+      <w:pPr>
+        <w:spacing w:after="0"/>
+      </w:pPr>
+      <w:r>
+        <w:t xml:space="preserve">Code · JAVA </w:t>
+      </w:r>
+    </w:p>
+    <w:p>
+      <w:pPr>
+        <w:spacing w:after="0"/>
+      </w:pPr>
+    </w:p>
+    <w:p>
+      <w:pPr>
+        <w:spacing w:after="0"/>
+      </w:pPr>
+      <w:r>
+        <w:t>Ottplandto</w:t>
+      </w:r>
+    </w:p>
+    <w:p>
+      <w:pPr>
+        <w:spacing w:after="0"/>
+      </w:pPr>
+      <w:r>
+        <w:t xml:space="preserve">Code · JAVA </w:t>
+      </w:r>
+    </w:p>
+    <w:p>
+      <w:pPr>
+        <w:spacing w:after="0"/>
+      </w:pPr>
+    </w:p>
+    <w:p>
+      <w:pPr>
+        <w:spacing w:after="0"/>
+      </w:pPr>
+      <w:r>
+        <w:lastRenderedPageBreak/>
+        <w:t>Subscriptionresponsedto</w:t>
+      </w:r>
+    </w:p>
+    <w:p>
+      <w:pPr>
+        <w:spacing w:after="0"/>
+      </w:pPr>
+      <w:r>
+        <w:t xml:space="preserve">Code · JAVA </w:t>
+      </w:r>
+    </w:p>
+    <w:p>
+      <w:pPr>
+        <w:spacing w:after="0"/>
+      </w:pPr>
+    </w:p>
+    <w:p>
+      <w:pPr>
+        <w:spacing w:after="0"/>
+      </w:pPr>
+      <w:r>
+        <w:t>Subscriptionnotfoundexception</w:t>
+      </w:r>
+    </w:p>
+    <w:p>
+      <w:pPr>
+        <w:spacing w:after="0"/>
+      </w:pPr>
+      <w:r>
+        <w:t xml:space="preserve">Code · JAVA </w:t>
+      </w:r>
+    </w:p>
+    <w:p>
+      <w:pPr>
+        <w:spacing w:after="0"/>
+      </w:pPr>
+    </w:p>
+    <w:p>
+      <w:pPr>
+        <w:spacing w:after="0"/>
+      </w:pPr>
+      <w:r>
+        <w:t>Usernotfoundexception</w:t>
+      </w:r>
+    </w:p>
+    <w:p>
+      <w:pPr>
+        <w:spacing w:after="0"/>
+      </w:pPr>
+      <w:r>
+        <w:t xml:space="preserve">Code · JAVA </w:t>
+      </w:r>
+    </w:p>
+    <w:p>
+      <w:pPr>
+        <w:spacing w:after="0"/>
+      </w:pPr>
+    </w:p>
+    <w:p>
+      <w:pPr>
+        <w:spacing w:after="0"/>
+      </w:pPr>
+      <w:r>
+        <w:t>Subscriptionservice</w:t>
+      </w:r>
+    </w:p>
+    <w:p>
+      <w:pPr>
+        <w:spacing w:after="0"/>
+      </w:pPr>
+      <w:r>
+        <w:t xml:space="preserve">Code · JAVA </w:t>
+      </w:r>
+    </w:p>
+    <w:p>
+      <w:r>
+        <w:drawing>
+          <wp:inline distT="0" distB="0" distL="0" distR="0" wp14:anchorId="3506EE74" wp14:editId="3AF14090">
+            <wp:extent cx="5731510" cy="3514090"/>
+            <wp:effectExtent l="0" t="0" r="2540" b="0"/>
+            <wp:docPr id="2" name="Picture 2"/>
+            <wp:cNvGraphicFramePr>
+              <a:graphicFrameLocks xmlns:a="http://schemas.openxmlformats.org/drawingml/2006/main" noChangeAspect="1"/>
+            </wp:cNvGraphicFramePr>
+            <a:graphic xmlns:a="http://schemas.openxmlformats.org/drawingml/2006/main">
+              <a:graphicData uri="http://schemas.openxmlformats.org/drawingml/2006/picture">
+                <pic:pic xmlns:pic="http://schemas.openxmlformats.org/drawingml/2006/picture">
+                  <pic:nvPicPr>
+                    <pic:cNvPr id="1" name=""/>
+                    <pic:cNvPicPr/>
+                  </pic:nvPicPr>
+                  <pic:blipFill>
+                    <a:blip r:embed="rId14"/>
+                    <a:stretch>
+                      <a:fillRect/>
+                    </a:stretch>
+                  </pic:blipFill>
+                  <pic:spPr>
+                    <a:xfrm>
+                      <a:off x="0" y="0"/>
+                      <a:ext cx="5731510" cy="3514090"/>
+                    </a:xfrm>
+                    <a:prstGeom prst="rect">
+                      <a:avLst/>
+                    </a:prstGeom>
+                  </pic:spPr>
+                </pic:pic>
+              </a:graphicData>
+            </a:graphic>
+          </wp:inline>
+        </w:drawing>
       </w:r>
       <w:bookmarkStart w:id="0" w:name="_GoBack"/>
       <w:bookmarkEnd w:id="0"/>
@@ -7146,385 +6906,6 @@
       <w:pPr>
         <w:spacing w:after="0"/>
       </w:pPr>
-      <w:r>
-        <w:t>SubscriptionServiceApplication.java — adds @EnableFeignClients</w:t>
-      </w:r>
-    </w:p>
-    <w:p>
-      <w:pPr>
-        <w:spacing w:after="0"/>
-      </w:pPr>
-      <w:r>
-        <w:t>application.properties — adds Feign logging config</w:t>
-      </w:r>
-    </w:p>
-    <w:p>
-      <w:pPr>
-        <w:spacing w:after="0"/>
-      </w:pPr>
-      <w:proofErr w:type="gramStart"/>
-      <w:r>
-        <w:t>config/AppConfig.java</w:t>
-      </w:r>
-      <w:proofErr w:type="gramEnd"/>
-      <w:r>
-        <w:t xml:space="preserve"> — removes RestTemplate bean, adds Feign config</w:t>
-      </w:r>
-    </w:p>
-    <w:p>
-      <w:pPr>
-        <w:spacing w:after="0"/>
-      </w:pPr>
-      <w:proofErr w:type="gramStart"/>
-      <w:r>
-        <w:t>service/SubscriptionService.java</w:t>
-      </w:r>
-      <w:proofErr w:type="gramEnd"/>
-      <w:r>
-        <w:t xml:space="preserve"> — uses CatalogServiceClient instead of CatalogClient</w:t>
-      </w:r>
-    </w:p>
-    <w:p>
-      <w:pPr>
-        <w:spacing w:after="0"/>
-      </w:pPr>
-      <w:r>
-        <w:t>Files to CREATE (brand new):</w:t>
-      </w:r>
-    </w:p>
-    <w:p>
-      <w:pPr>
-        <w:spacing w:after="0"/>
-      </w:pPr>
-    </w:p>
-    <w:p>
-      <w:pPr>
-        <w:spacing w:after="0"/>
-      </w:pPr>
-      <w:proofErr w:type="gramStart"/>
-      <w:r>
-        <w:t>client/CatalogServiceClient.java</w:t>
-      </w:r>
-      <w:proofErr w:type="gramEnd"/>
-      <w:r>
-        <w:t xml:space="preserve"> — Feign interface</w:t>
-      </w:r>
-    </w:p>
-    <w:p>
-      <w:pPr>
-        <w:spacing w:after="0"/>
-      </w:pPr>
-      <w:proofErr w:type="gramStart"/>
-      <w:r>
-        <w:t>client/FeignErrorDecoder.java</w:t>
-      </w:r>
-      <w:proofErr w:type="gramEnd"/>
-      <w:r>
-        <w:t xml:space="preserve"> — handles Catalog Service errors</w:t>
-      </w:r>
-    </w:p>
-    <w:p>
-      <w:pPr>
-        <w:spacing w:after="0"/>
-      </w:pPr>
-      <w:proofErr w:type="gramStart"/>
-      <w:r>
-        <w:t>dto/OttPlanDTO.java</w:t>
-      </w:r>
-      <w:proofErr w:type="gramEnd"/>
-      <w:r>
-        <w:t xml:space="preserve"> — maps Catalog Service JSON response</w:t>
-      </w:r>
-    </w:p>
-    <w:p>
-      <w:pPr>
-        <w:spacing w:after="0"/>
-      </w:pPr>
-      <w:proofErr w:type="gramStart"/>
-      <w:r>
-        <w:t>dto/SubscriptionResponseDTO.java</w:t>
-      </w:r>
-      <w:proofErr w:type="gramEnd"/>
-      <w:r>
-        <w:t xml:space="preserve"> — was missing</w:t>
-      </w:r>
-    </w:p>
-    <w:p>
-      <w:pPr>
-        <w:spacing w:after="0"/>
-      </w:pPr>
-      <w:proofErr w:type="gramStart"/>
-      <w:r>
-        <w:t>exception/SubscriptionNotFoundException.java</w:t>
-      </w:r>
-      <w:proofErr w:type="gramEnd"/>
-      <w:r>
-        <w:t xml:space="preserve"> — was missing</w:t>
-      </w:r>
-    </w:p>
-    <w:p>
-      <w:pPr>
-        <w:spacing w:after="0"/>
-      </w:pPr>
-      <w:proofErr w:type="gramStart"/>
-      <w:r>
-        <w:t>exception/UserNotFoundException.java</w:t>
-      </w:r>
-      <w:proofErr w:type="gramEnd"/>
-      <w:r>
-        <w:t xml:space="preserve"> — was missing</w:t>
-      </w:r>
-    </w:p>
-    <w:p>
-      <w:pPr>
-        <w:spacing w:after="0"/>
-      </w:pPr>
-      <w:r>
-        <w:t xml:space="preserve">After updating pom.xml, right-click project → Maven → Update Project → OK and STS will download Feign automatically. Then run catalog-service first, then subscription-service. </w:t>
-      </w:r>
-      <w:r>
-        <w:rPr>
-          <w:rFonts w:ascii="Segoe UI Symbol" w:hAnsi="Segoe UI Symbol" w:cs="Segoe UI Symbol"/>
-        </w:rPr>
-        <w:t>🚀</w:t>
-      </w:r>
-    </w:p>
-    <w:p>
-      <w:pPr>
-        <w:spacing w:after="0"/>
-      </w:pPr>
-    </w:p>
-    <w:p>
-      <w:pPr>
-        <w:spacing w:after="0"/>
-      </w:pPr>
-    </w:p>
-    <w:p>
-      <w:pPr>
-        <w:spacing w:after="0"/>
-      </w:pPr>
-      <w:r>
-        <w:t>Pom</w:t>
-      </w:r>
-    </w:p>
-    <w:p>
-      <w:pPr>
-        <w:spacing w:after="0"/>
-      </w:pPr>
-      <w:r>
-        <w:t xml:space="preserve">XML </w:t>
-      </w:r>
-    </w:p>
-    <w:p>
-      <w:pPr>
-        <w:spacing w:after="0"/>
-      </w:pPr>
-    </w:p>
-    <w:p>
-      <w:pPr>
-        <w:spacing w:after="0"/>
-      </w:pPr>
-      <w:r>
-        <w:t>Subscriptionserviceapplication</w:t>
-      </w:r>
-    </w:p>
-    <w:p>
-      <w:pPr>
-        <w:spacing w:after="0"/>
-      </w:pPr>
-      <w:r>
-        <w:t xml:space="preserve">Code · JAVA </w:t>
-      </w:r>
-    </w:p>
-    <w:p>
-      <w:pPr>
-        <w:spacing w:after="0"/>
-      </w:pPr>
-    </w:p>
-    <w:p>
-      <w:pPr>
-        <w:spacing w:after="0"/>
-      </w:pPr>
-      <w:r>
-        <w:t>Application</w:t>
-      </w:r>
-    </w:p>
-    <w:p>
-      <w:pPr>
-        <w:spacing w:after="0"/>
-      </w:pPr>
-      <w:r>
-        <w:t xml:space="preserve">PROPERTIES </w:t>
-      </w:r>
-    </w:p>
-    <w:p>
-      <w:pPr>
-        <w:spacing w:after="0"/>
-      </w:pPr>
-    </w:p>
-    <w:p>
-      <w:pPr>
-        <w:spacing w:after="0"/>
-      </w:pPr>
-      <w:r>
-        <w:t>Catalogserviceclient</w:t>
-      </w:r>
-    </w:p>
-    <w:p>
-      <w:pPr>
-        <w:spacing w:after="0"/>
-      </w:pPr>
-      <w:r>
-        <w:t xml:space="preserve">Code · JAVA </w:t>
-      </w:r>
-    </w:p>
-    <w:p>
-      <w:pPr>
-        <w:spacing w:after="0"/>
-      </w:pPr>
-    </w:p>
-    <w:p>
-      <w:pPr>
-        <w:spacing w:after="0"/>
-      </w:pPr>
-      <w:r>
-        <w:t>Feignerrordecoder</w:t>
-      </w:r>
-    </w:p>
-    <w:p>
-      <w:pPr>
-        <w:spacing w:after="0"/>
-      </w:pPr>
-      <w:r>
-        <w:t xml:space="preserve">Code · JAVA </w:t>
-      </w:r>
-    </w:p>
-    <w:p>
-      <w:pPr>
-        <w:spacing w:after="0"/>
-      </w:pPr>
-    </w:p>
-    <w:p>
-      <w:pPr>
-        <w:spacing w:after="0"/>
-      </w:pPr>
-      <w:r>
-        <w:t>Appconfig</w:t>
-      </w:r>
-    </w:p>
-    <w:p>
-      <w:pPr>
-        <w:spacing w:after="0"/>
-      </w:pPr>
-      <w:r>
-        <w:t xml:space="preserve">Code · JAVA </w:t>
-      </w:r>
-    </w:p>
-    <w:p>
-      <w:pPr>
-        <w:spacing w:after="0"/>
-      </w:pPr>
-    </w:p>
-    <w:p>
-      <w:pPr>
-        <w:spacing w:after="0"/>
-      </w:pPr>
-      <w:r>
-        <w:t>Ottplandto</w:t>
-      </w:r>
-    </w:p>
-    <w:p>
-      <w:pPr>
-        <w:spacing w:after="0"/>
-      </w:pPr>
-      <w:r>
-        <w:t xml:space="preserve">Code · JAVA </w:t>
-      </w:r>
-    </w:p>
-    <w:p>
-      <w:pPr>
-        <w:spacing w:after="0"/>
-      </w:pPr>
-    </w:p>
-    <w:p>
-      <w:pPr>
-        <w:spacing w:after="0"/>
-      </w:pPr>
-      <w:r>
-        <w:lastRenderedPageBreak/>
-        <w:t>Subscriptionresponsedto</w:t>
-      </w:r>
-    </w:p>
-    <w:p>
-      <w:pPr>
-        <w:spacing w:after="0"/>
-      </w:pPr>
-      <w:r>
-        <w:t xml:space="preserve">Code · JAVA </w:t>
-      </w:r>
-    </w:p>
-    <w:p>
-      <w:pPr>
-        <w:spacing w:after="0"/>
-      </w:pPr>
-    </w:p>
-    <w:p>
-      <w:pPr>
-        <w:spacing w:after="0"/>
-      </w:pPr>
-      <w:r>
-        <w:t>Subscriptionnotfoundexception</w:t>
-      </w:r>
-    </w:p>
-    <w:p>
-      <w:pPr>
-        <w:spacing w:after="0"/>
-      </w:pPr>
-      <w:r>
-        <w:t xml:space="preserve">Code · JAVA </w:t>
-      </w:r>
-    </w:p>
-    <w:p>
-      <w:pPr>
-        <w:spacing w:after="0"/>
-      </w:pPr>
-    </w:p>
-    <w:p>
-      <w:pPr>
-        <w:spacing w:after="0"/>
-      </w:pPr>
-      <w:r>
-        <w:t>Usernotfoundexception</w:t>
-      </w:r>
-    </w:p>
-    <w:p>
-      <w:pPr>
-        <w:spacing w:after="0"/>
-      </w:pPr>
-      <w:r>
-        <w:t xml:space="preserve">Code · JAVA </w:t>
-      </w:r>
-    </w:p>
-    <w:p>
-      <w:pPr>
-        <w:spacing w:after="0"/>
-      </w:pPr>
-    </w:p>
-    <w:p>
-      <w:pPr>
-        <w:spacing w:after="0"/>
-      </w:pPr>
-      <w:r>
-        <w:t>Subscriptionservice</w:t>
-      </w:r>
-    </w:p>
-    <w:p>
-      <w:pPr>
-        <w:spacing w:after="0"/>
-      </w:pPr>
-      <w:r>
-        <w:t xml:space="preserve">Code · JAVA </w:t>
-      </w:r>
     </w:p>
     <w:sectPr>
       <w:pgSz w:w="11906" w:h="16838"/>
@@ -9407,7 +8788,7 @@
 </file>
 
 <file path=customXml/itemProps1.xml><?xml version="1.0" encoding="utf-8"?>
-<ds:datastoreItem xmlns:ds="http://schemas.openxmlformats.org/officeDocument/2006/customXml" ds:itemID="{CC70DCD4-C2C6-40A4-AA68-7E7AC98CA4A2}">
+<ds:datastoreItem xmlns:ds="http://schemas.openxmlformats.org/officeDocument/2006/customXml" ds:itemID="{96BCBAC3-9184-494E-A8B1-16AE6414F17D}">
   <ds:schemaRefs>
     <ds:schemaRef ds:uri="http://schemas.openxmlformats.org/officeDocument/2006/bibliography"/>
   </ds:schemaRefs>

</xml_diff>